<commit_message>
Update template for logo and report time
</commit_message>
<xml_diff>
--- a/src/src/main/webapp/portal/wo/woExportTemplate/template.docx
+++ b/src/src/main/webapp/portal/wo/woExportTemplate/template.docx
@@ -2,6 +2,82 @@
 <file path=word/document.xml><?xml version="1.0" encoding="utf-8"?>
 <w:document xmlns:wpc="http://schemas.microsoft.com/office/word/2010/wordprocessingCanvas" xmlns:cx="http://schemas.microsoft.com/office/drawing/2014/chartex" xmlns:cx1="http://schemas.microsoft.com/office/drawing/2015/9/8/chartex" xmlns:cx2="http://schemas.microsoft.com/office/drawing/2015/10/21/chartex" xmlns:cx3="http://schemas.microsoft.com/office/drawing/2016/5/9/chartex" xmlns:cx4="http://schemas.microsoft.com/office/drawing/2016/5/10/chartex" xmlns:cx5="http://schemas.microsoft.com/office/drawing/2016/5/11/chartex" xmlns:cx6="http://schemas.microsoft.com/office/drawing/2016/5/12/chartex" xmlns:cx7="http://schemas.microsoft.com/office/drawing/2016/5/13/chartex" xmlns:cx8="http://schemas.microsoft.com/office/drawing/2016/5/14/chartex" xmlns:mc="http://schemas.openxmlformats.org/markup-compatibility/2006" xmlns:aink="http://schemas.microsoft.com/office/drawing/2016/ink" xmlns:am3d="http://schemas.microsoft.com/office/drawing/2017/model3d" xmlns:o="urn:schemas-microsoft-com:office:office" xmlns:r="http://schemas.openxmlformats.org/officeDocument/2006/relationships" xmlns:m="http://schemas.openxmlformats.org/officeDocument/2006/math" xmlns:v="urn:schemas-microsoft-com:vml" xmlns:wp14="http://schemas.microsoft.com/office/word/2010/wordprocessingDrawing" xmlns:wp="http://schemas.openxmlformats.org/drawingml/2006/wordprocessingDrawing" xmlns:w10="urn:schemas-microsoft-com:office:word" xmlns:w="http://schemas.openxmlformats.org/wordprocessingml/2006/main" xmlns:w14="http://schemas.microsoft.com/office/word/2010/wordml" xmlns:w15="http://schemas.microsoft.com/office/word/2012/wordml" xmlns:w16cid="http://schemas.microsoft.com/office/word/2016/wordml/cid" xmlns:w16se="http://schemas.microsoft.com/office/word/2015/wordml/symex" xmlns:wpg="http://schemas.microsoft.com/office/word/2010/wordprocessingGroup" xmlns:wpi="http://schemas.microsoft.com/office/word/2010/wordprocessingInk" xmlns:wne="http://schemas.microsoft.com/office/word/2006/wordml" xmlns:wps="http://schemas.microsoft.com/office/word/2010/wordprocessingShape" mc:Ignorable="w14 w15 w16se w16cid wp14">
   <w:body>
+    <w:p>
+      <w:pPr>
+        <w:jc w:val="center"/>
+        <w:rPr>
+          <w:rFonts w:ascii="微软雅黑" w:eastAsia="微软雅黑" w:hAnsi="微软雅黑"/>
+          <w:b/>
+          <w:sz w:val="24"/>
+          <w:szCs w:val="24"/>
+        </w:rPr>
+      </w:pPr>
+      <w:r>
+        <w:rPr>
+          <w:rFonts w:ascii="微软雅黑" w:eastAsia="微软雅黑" w:hAnsi="微软雅黑"/>
+          <w:b/>
+          <w:noProof/>
+          <w:sz w:val="24"/>
+          <w:szCs w:val="24"/>
+        </w:rPr>
+        <w:drawing>
+          <wp:anchor distT="0" distB="0" distL="114300" distR="114300" simplePos="0" relativeHeight="251658240" behindDoc="0" locked="0" layoutInCell="1" allowOverlap="1">
+            <wp:simplePos x="0" y="0"/>
+            <wp:positionH relativeFrom="margin">
+              <wp:posOffset>-9525</wp:posOffset>
+            </wp:positionH>
+            <wp:positionV relativeFrom="paragraph">
+              <wp:posOffset>5715</wp:posOffset>
+            </wp:positionV>
+            <wp:extent cx="1590675" cy="485775"/>
+            <wp:effectExtent l="0" t="0" r="9525" b="9525"/>
+            <wp:wrapNone/>
+            <wp:docPr id="1" name="Picture 1" descr="D:\workspace\hc-apm-web\src\src\main\webapp\portal\pdf\ge.jpg"/>
+            <wp:cNvGraphicFramePr>
+              <a:graphicFrameLocks xmlns:a="http://schemas.openxmlformats.org/drawingml/2006/main" noChangeAspect="1"/>
+            </wp:cNvGraphicFramePr>
+            <a:graphic xmlns:a="http://schemas.openxmlformats.org/drawingml/2006/main">
+              <a:graphicData uri="http://schemas.openxmlformats.org/drawingml/2006/picture">
+                <pic:pic xmlns:pic="http://schemas.openxmlformats.org/drawingml/2006/picture">
+                  <pic:nvPicPr>
+                    <pic:cNvPr id="0" name="Picture 1" descr="D:\workspace\hc-apm-web\src\src\main\webapp\portal\pdf\ge.jpg"/>
+                    <pic:cNvPicPr>
+                      <a:picLocks noChangeAspect="1" noChangeArrowheads="1"/>
+                    </pic:cNvPicPr>
+                  </pic:nvPicPr>
+                  <pic:blipFill>
+                    <a:blip r:embed="rId5">
+                      <a:extLst>
+                        <a:ext uri="{28A0092B-C50C-407E-A947-70E740481C1C}">
+                          <a14:useLocalDpi xmlns:a14="http://schemas.microsoft.com/office/drawing/2010/main" val="0"/>
+                        </a:ext>
+                      </a:extLst>
+                    </a:blip>
+                    <a:srcRect/>
+                    <a:stretch>
+                      <a:fillRect/>
+                    </a:stretch>
+                  </pic:blipFill>
+                  <pic:spPr bwMode="auto">
+                    <a:xfrm>
+                      <a:off x="0" y="0"/>
+                      <a:ext cx="1590675" cy="485775"/>
+                    </a:xfrm>
+                    <a:prstGeom prst="rect">
+                      <a:avLst/>
+                    </a:prstGeom>
+                    <a:noFill/>
+                    <a:ln>
+                      <a:noFill/>
+                    </a:ln>
+                  </pic:spPr>
+                </pic:pic>
+              </a:graphicData>
+            </a:graphic>
+          </wp:anchor>
+        </w:drawing>
+      </w:r>
+    </w:p>
     <w:p>
       <w:pPr>
         <w:jc w:val="center"/>
@@ -897,6 +973,8 @@
             </w:pPr>
           </w:p>
         </w:tc>
+        <w:bookmarkStart w:id="0" w:name="_GoBack"/>
+        <w:bookmarkEnd w:id="0"/>
       </w:tr>
       <w:tr>
         <w:tc>
@@ -1032,7 +1110,14 @@
                 <w:sz w:val="20"/>
                 <w:szCs w:val="20"/>
               </w:rPr>
-              <w:t>issue_reporte_time</w:t>
+              <w:t>issue_report</w:t>
+            </w:r>
+            <w:r>
+              <w:rPr>
+                <w:sz w:val="20"/>
+                <w:szCs w:val="20"/>
+              </w:rPr>
+              <w:t>_time</w:t>
             </w:r>
             <w:proofErr w:type="spellEnd"/>
             <w:r>
@@ -1493,7 +1578,6 @@
             <w:pPr>
               <w:jc w:val="center"/>
               <w:rPr>
-                <w:rFonts w:hint="eastAsia"/>
                 <w:sz w:val="20"/>
                 <w:szCs w:val="20"/>
               </w:rPr>
@@ -1517,7 +1601,6 @@
             <w:pPr>
               <w:jc w:val="center"/>
               <w:rPr>
-                <w:rFonts w:hint="eastAsia"/>
                 <w:sz w:val="20"/>
                 <w:szCs w:val="20"/>
               </w:rPr>
@@ -1577,7 +1660,6 @@
             <w:pPr>
               <w:jc w:val="center"/>
               <w:rPr>
-                <w:rFonts w:hint="eastAsia"/>
                 <w:sz w:val="20"/>
                 <w:szCs w:val="20"/>
               </w:rPr>
@@ -1637,7 +1719,6 @@
             <w:pPr>
               <w:jc w:val="center"/>
               <w:rPr>
-                <w:rFonts w:hint="eastAsia"/>
                 <w:sz w:val="20"/>
                 <w:szCs w:val="20"/>
               </w:rPr>
@@ -2253,8 +2334,6 @@
             </w:r>
           </w:p>
         </w:tc>
-        <w:bookmarkStart w:id="0" w:name="_GoBack"/>
-        <w:bookmarkEnd w:id="0"/>
       </w:tr>
       <w:tr>
         <w:tc>
@@ -3783,7 +3862,7 @@
 </file>
 
 <file path=customXml/itemProps1.xml><?xml version="1.0" encoding="utf-8"?>
-<ds:datastoreItem xmlns:ds="http://schemas.openxmlformats.org/officeDocument/2006/customXml" ds:itemID="{3B5E37C8-37C6-4E90-A26C-EFE011325241}">
+<ds:datastoreItem xmlns:ds="http://schemas.openxmlformats.org/officeDocument/2006/customXml" ds:itemID="{488E4CC7-33C2-4F0C-B33E-CDDF12BA75A7}">
   <ds:schemaRefs>
     <ds:schemaRef ds:uri="http://schemas.openxmlformats.org/officeDocument/2006/bibliography"/>
   </ds:schemaRefs>

</xml_diff>

<commit_message>
YHAAO-2423 digital sign support
</commit_message>
<xml_diff>
--- a/src/src/main/webapp/portal/wo/woExportTemplate/template.docx
+++ b/src/src/main/webapp/portal/wo/woExportTemplate/template.docx
@@ -973,8 +973,6 @@
             </w:pPr>
           </w:p>
         </w:tc>
-        <w:bookmarkStart w:id="0" w:name="_GoBack"/>
-        <w:bookmarkEnd w:id="0"/>
       </w:tr>
       <w:tr>
         <w:tc>
@@ -3104,6 +3102,82 @@
       <w:pPr>
         <w:jc w:val="center"/>
       </w:pPr>
+      <w:bookmarkStart w:id="0" w:name="_GoBack"/>
+      <w:bookmarkEnd w:id="0"/>
+    </w:p>
+    <w:p>
+      <w:pPr>
+        <w:jc w:val="right"/>
+      </w:pPr>
+      <w:r>
+        <w:rPr>
+          <w:rFonts w:hint="eastAsia"/>
+        </w:rPr>
+        <w:t>验收人签名</w:t>
+      </w:r>
+      <w:r>
+        <w:t>: {{</w:t>
+      </w:r>
+      <w:r>
+        <w:t>@</w:t>
+      </w:r>
+      <w:proofErr w:type="spellStart"/>
+      <w:r>
+        <w:t>ack</w:t>
+      </w:r>
+      <w:r>
+        <w:t>_s</w:t>
+      </w:r>
+      <w:r>
+        <w:t>ignature</w:t>
+      </w:r>
+      <w:proofErr w:type="spellEnd"/>
+      <w:r>
+        <w:t>}}</w:t>
+      </w:r>
+      <w:r>
+        <w:t>{{</w:t>
+      </w:r>
+      <w:proofErr w:type="spellStart"/>
+      <w:r>
+        <w:t>ack_signature_space</w:t>
+      </w:r>
+      <w:proofErr w:type="spellEnd"/>
+      <w:r>
+        <w:t>}}</w:t>
+      </w:r>
+    </w:p>
+    <w:p>
+      <w:pPr>
+        <w:jc w:val="right"/>
+      </w:pPr>
+      <w:r>
+        <w:rPr>
+          <w:rFonts w:hint="eastAsia"/>
+        </w:rPr>
+        <w:lastRenderedPageBreak/>
+        <w:t>审核人签名：</w:t>
+      </w:r>
+      <w:r>
+        <w:t>{{</w:t>
+      </w:r>
+      <w:r>
+        <w:t>@</w:t>
+      </w:r>
+      <w:r>
+        <w:t>signature}}</w:t>
+      </w:r>
+      <w:r>
+        <w:t>{{</w:t>
+      </w:r>
+      <w:proofErr w:type="spellStart"/>
+      <w:r>
+        <w:t>signature_space</w:t>
+      </w:r>
+      <w:proofErr w:type="spellEnd"/>
+      <w:r>
+        <w:t>}}</w:t>
+      </w:r>
     </w:p>
     <w:sectPr>
       <w:pgSz w:w="12240" w:h="15840"/>
@@ -3862,7 +3936,7 @@
 </file>
 
 <file path=customXml/itemProps1.xml><?xml version="1.0" encoding="utf-8"?>
-<ds:datastoreItem xmlns:ds="http://schemas.openxmlformats.org/officeDocument/2006/customXml" ds:itemID="{488E4CC7-33C2-4F0C-B33E-CDDF12BA75A7}">
+<ds:datastoreItem xmlns:ds="http://schemas.openxmlformats.org/officeDocument/2006/customXml" ds:itemID="{C548C70B-EEC4-47CD-8D06-9C3022958D02}">
   <ds:schemaRefs>
     <ds:schemaRef ds:uri="http://schemas.openxmlformats.org/officeDocument/2006/bibliography"/>
   </ds:schemaRefs>

</xml_diff>

<commit_message>
Cache dot image Update template
</commit_message>
<xml_diff>
--- a/src/src/main/webapp/portal/wo/woExportTemplate/template.docx
+++ b/src/src/main/webapp/portal/wo/woExportTemplate/template.docx
@@ -197,7 +197,6 @@
               </w:rPr>
               <w:t>{{</w:t>
             </w:r>
-            <w:proofErr w:type="spellStart"/>
             <w:r>
               <w:rPr>
                 <w:rFonts w:hint="eastAsia"/>
@@ -206,7 +205,6 @@
               </w:rPr>
               <w:t>device_name</w:t>
             </w:r>
-            <w:proofErr w:type="spellEnd"/>
             <w:r>
               <w:rPr>
                 <w:sz w:val="20"/>
@@ -262,23 +260,7 @@
                 <w:sz w:val="20"/>
                 <w:szCs w:val="20"/>
               </w:rPr>
-              <w:t>{{</w:t>
-            </w:r>
-            <w:proofErr w:type="spellStart"/>
-            <w:r>
-              <w:rPr>
-                <w:sz w:val="20"/>
-                <w:szCs w:val="20"/>
-              </w:rPr>
-              <w:t>device_department</w:t>
-            </w:r>
-            <w:proofErr w:type="spellEnd"/>
-            <w:r>
-              <w:rPr>
-                <w:sz w:val="20"/>
-                <w:szCs w:val="20"/>
-              </w:rPr>
-              <w:t>}}</w:t>
+              <w:t>{{device_department}}</w:t>
             </w:r>
           </w:p>
         </w:tc>
@@ -332,7 +314,6 @@
               </w:rPr>
               <w:t>{{</w:t>
             </w:r>
-            <w:proofErr w:type="spellStart"/>
             <w:r>
               <w:rPr>
                 <w:sz w:val="20"/>
@@ -340,7 +321,6 @@
               </w:rPr>
               <w:t>device_type</w:t>
             </w:r>
-            <w:proofErr w:type="spellEnd"/>
             <w:r>
               <w:rPr>
                 <w:sz w:val="20"/>
@@ -396,23 +376,7 @@
                 <w:sz w:val="20"/>
                 <w:szCs w:val="20"/>
               </w:rPr>
-              <w:t>{{</w:t>
-            </w:r>
-            <w:proofErr w:type="spellStart"/>
-            <w:r>
-              <w:rPr>
-                <w:sz w:val="20"/>
-                <w:szCs w:val="20"/>
-              </w:rPr>
-              <w:t>device_oem</w:t>
-            </w:r>
-            <w:proofErr w:type="spellEnd"/>
-            <w:r>
-              <w:rPr>
-                <w:sz w:val="20"/>
-                <w:szCs w:val="20"/>
-              </w:rPr>
-              <w:t>}}</w:t>
+              <w:t>{{device_oem}}</w:t>
             </w:r>
           </w:p>
         </w:tc>
@@ -458,7 +422,6 @@
               </w:rPr>
               <w:t>{{</w:t>
             </w:r>
-            <w:proofErr w:type="spellStart"/>
             <w:r>
               <w:rPr>
                 <w:sz w:val="20"/>
@@ -466,7 +429,6 @@
               </w:rPr>
               <w:t>device_serial</w:t>
             </w:r>
-            <w:proofErr w:type="spellEnd"/>
             <w:r>
               <w:rPr>
                 <w:sz w:val="20"/>
@@ -522,23 +484,7 @@
                 <w:sz w:val="20"/>
                 <w:szCs w:val="20"/>
               </w:rPr>
-              <w:t>{{</w:t>
-            </w:r>
-            <w:proofErr w:type="spellStart"/>
-            <w:r>
-              <w:rPr>
-                <w:sz w:val="20"/>
-                <w:szCs w:val="20"/>
-              </w:rPr>
-              <w:t>device_number</w:t>
-            </w:r>
-            <w:proofErr w:type="spellEnd"/>
-            <w:r>
-              <w:rPr>
-                <w:sz w:val="20"/>
-                <w:szCs w:val="20"/>
-              </w:rPr>
-              <w:t>}}</w:t>
+              <w:t>{{device_number}}</w:t>
             </w:r>
           </w:p>
         </w:tc>
@@ -592,7 +538,6 @@
               </w:rPr>
               <w:t>{{</w:t>
             </w:r>
-            <w:proofErr w:type="spellStart"/>
             <w:r>
               <w:rPr>
                 <w:sz w:val="20"/>
@@ -600,7 +545,6 @@
               </w:rPr>
               <w:t>device_qr</w:t>
             </w:r>
-            <w:proofErr w:type="spellEnd"/>
             <w:r>
               <w:rPr>
                 <w:sz w:val="20"/>
@@ -656,23 +600,7 @@
                 <w:sz w:val="20"/>
                 <w:szCs w:val="20"/>
               </w:rPr>
-              <w:t>{{</w:t>
-            </w:r>
-            <w:proofErr w:type="spellStart"/>
-            <w:r>
-              <w:rPr>
-                <w:sz w:val="20"/>
-                <w:szCs w:val="20"/>
-              </w:rPr>
-              <w:t>device_location</w:t>
-            </w:r>
-            <w:proofErr w:type="spellEnd"/>
-            <w:r>
-              <w:rPr>
-                <w:sz w:val="20"/>
-                <w:szCs w:val="20"/>
-              </w:rPr>
-              <w:t>}}</w:t>
+              <w:t>{{device_location}}</w:t>
             </w:r>
           </w:p>
         </w:tc>
@@ -778,23 +706,7 @@
                 <w:sz w:val="20"/>
                 <w:szCs w:val="20"/>
               </w:rPr>
-              <w:t>{{</w:t>
-            </w:r>
-            <w:proofErr w:type="spellStart"/>
-            <w:r>
-              <w:rPr>
-                <w:sz w:val="20"/>
-                <w:szCs w:val="20"/>
-              </w:rPr>
-              <w:t>issue_number</w:t>
-            </w:r>
-            <w:proofErr w:type="spellEnd"/>
-            <w:r>
-              <w:rPr>
-                <w:sz w:val="20"/>
-                <w:szCs w:val="20"/>
-              </w:rPr>
-              <w:t>}}</w:t>
+              <w:t>{{issue_number}}</w:t>
             </w:r>
           </w:p>
         </w:tc>
@@ -838,23 +750,7 @@
                 <w:sz w:val="20"/>
                 <w:szCs w:val="20"/>
               </w:rPr>
-              <w:t>{</w:t>
-            </w:r>
-            <w:proofErr w:type="spellStart"/>
-            <w:r>
-              <w:rPr>
-                <w:sz w:val="20"/>
-                <w:szCs w:val="20"/>
-              </w:rPr>
-              <w:t>issue_desc</w:t>
-            </w:r>
-            <w:proofErr w:type="spellEnd"/>
-            <w:r>
-              <w:rPr>
-                <w:sz w:val="20"/>
-                <w:szCs w:val="20"/>
-              </w:rPr>
-              <w:t>}</w:t>
+              <w:t>{issue_desc}</w:t>
             </w:r>
             <w:r>
               <w:rPr>
@@ -942,23 +838,7 @@
                 <w:sz w:val="20"/>
                 <w:szCs w:val="20"/>
               </w:rPr>
-              <w:t>{{</w:t>
-            </w:r>
-            <w:proofErr w:type="spellStart"/>
-            <w:r>
-              <w:rPr>
-                <w:sz w:val="20"/>
-                <w:szCs w:val="20"/>
-              </w:rPr>
-              <w:t>issue_reporter</w:t>
-            </w:r>
-            <w:proofErr w:type="spellEnd"/>
-            <w:r>
-              <w:rPr>
-                <w:sz w:val="20"/>
-                <w:szCs w:val="20"/>
-              </w:rPr>
-              <w:t>}}</w:t>
+              <w:t>{{issue_reporter}}</w:t>
             </w:r>
           </w:p>
         </w:tc>
@@ -1021,23 +901,7 @@
                 <w:sz w:val="20"/>
                 <w:szCs w:val="20"/>
               </w:rPr>
-              <w:t>{{</w:t>
-            </w:r>
-            <w:proofErr w:type="spellStart"/>
-            <w:r>
-              <w:rPr>
-                <w:sz w:val="20"/>
-                <w:szCs w:val="20"/>
-              </w:rPr>
-              <w:t>issue_reporter_phone</w:t>
-            </w:r>
-            <w:proofErr w:type="spellEnd"/>
-            <w:r>
-              <w:rPr>
-                <w:sz w:val="20"/>
-                <w:szCs w:val="20"/>
-              </w:rPr>
-              <w:t>}}</w:t>
+              <w:t>{{issue_reporter_phone}}</w:t>
             </w:r>
           </w:p>
         </w:tc>
@@ -1100,30 +964,14 @@
                 <w:sz w:val="20"/>
                 <w:szCs w:val="20"/>
               </w:rPr>
-              <w:t>{{</w:t>
-            </w:r>
-            <w:proofErr w:type="spellStart"/>
-            <w:r>
-              <w:rPr>
-                <w:sz w:val="20"/>
-                <w:szCs w:val="20"/>
-              </w:rPr>
-              <w:t>issue_report</w:t>
-            </w:r>
-            <w:r>
-              <w:rPr>
-                <w:sz w:val="20"/>
-                <w:szCs w:val="20"/>
-              </w:rPr>
-              <w:t>_time</w:t>
-            </w:r>
-            <w:proofErr w:type="spellEnd"/>
-            <w:r>
-              <w:rPr>
-                <w:sz w:val="20"/>
-                <w:szCs w:val="20"/>
-              </w:rPr>
-              <w:t>}}</w:t>
+              <w:t>{{issue_report</w:t>
+            </w:r>
+            <w:r>
+              <w:rPr>
+                <w:sz w:val="20"/>
+                <w:szCs w:val="20"/>
+              </w:rPr>
+              <w:t>_time}}</w:t>
             </w:r>
           </w:p>
         </w:tc>
@@ -1186,23 +1034,7 @@
                 <w:sz w:val="20"/>
                 <w:szCs w:val="20"/>
               </w:rPr>
-              <w:t>{{</w:t>
-            </w:r>
-            <w:proofErr w:type="spellStart"/>
-            <w:r>
-              <w:rPr>
-                <w:sz w:val="20"/>
-                <w:szCs w:val="20"/>
-              </w:rPr>
-              <w:t>issue_report_status</w:t>
-            </w:r>
-            <w:proofErr w:type="spellEnd"/>
-            <w:r>
-              <w:rPr>
-                <w:sz w:val="20"/>
-                <w:szCs w:val="20"/>
-              </w:rPr>
-              <w:t>}}</w:t>
+              <w:t>{{issue_report_status}}</w:t>
             </w:r>
           </w:p>
         </w:tc>
@@ -1265,23 +1097,7 @@
                 <w:sz w:val="20"/>
                 <w:szCs w:val="20"/>
               </w:rPr>
-              <w:t>{{</w:t>
-            </w:r>
-            <w:proofErr w:type="spellStart"/>
-            <w:r>
-              <w:rPr>
-                <w:sz w:val="20"/>
-                <w:szCs w:val="20"/>
-              </w:rPr>
-              <w:t>issue_device_stop_time</w:t>
-            </w:r>
-            <w:proofErr w:type="spellEnd"/>
-            <w:r>
-              <w:rPr>
-                <w:sz w:val="20"/>
-                <w:szCs w:val="20"/>
-              </w:rPr>
-              <w:t>}}</w:t>
+              <w:t>{{issue_device_stop_time}}</w:t>
             </w:r>
           </w:p>
         </w:tc>
@@ -1390,19 +1206,69 @@
                 <w:sz w:val="20"/>
                 <w:szCs w:val="20"/>
               </w:rPr>
+              <w:t>{fix_status}</w:t>
+            </w:r>
+            <w:r>
+              <w:rPr>
+                <w:rFonts w:hint="eastAsia"/>
+                <w:sz w:val="20"/>
+                <w:szCs w:val="20"/>
+              </w:rPr>
+              <w:t>}</w:t>
+            </w:r>
+          </w:p>
+        </w:tc>
+        <w:tc>
+          <w:tcPr>
+            <w:tcW w:w="1620" w:type="dxa"/>
+          </w:tcPr>
+          <w:p>
+            <w:pPr>
+              <w:jc w:val="center"/>
+              <w:rPr>
+                <w:sz w:val="20"/>
+                <w:szCs w:val="20"/>
+              </w:rPr>
+            </w:pPr>
+            <w:r>
+              <w:rPr>
+                <w:rFonts w:hint="eastAsia"/>
+                <w:sz w:val="20"/>
+                <w:szCs w:val="20"/>
+              </w:rPr>
+              <w:t>总工时</w:t>
+            </w:r>
+          </w:p>
+        </w:tc>
+        <w:tc>
+          <w:tcPr>
+            <w:tcW w:w="1620" w:type="dxa"/>
+          </w:tcPr>
+          <w:p>
+            <w:pPr>
+              <w:jc w:val="center"/>
+              <w:rPr>
+                <w:sz w:val="20"/>
+                <w:szCs w:val="20"/>
+              </w:rPr>
+            </w:pPr>
+            <w:r>
+              <w:rPr>
+                <w:sz w:val="20"/>
+                <w:szCs w:val="20"/>
+              </w:rPr>
               <w:t>{</w:t>
             </w:r>
-            <w:proofErr w:type="spellStart"/>
-            <w:r>
-              <w:rPr>
-                <w:sz w:val="20"/>
-                <w:szCs w:val="20"/>
-              </w:rPr>
-              <w:t>fix_status</w:t>
-            </w:r>
-            <w:proofErr w:type="spellEnd"/>
-            <w:r>
-              <w:rPr>
+            <w:r>
+              <w:rPr>
+                <w:sz w:val="20"/>
+                <w:szCs w:val="20"/>
+              </w:rPr>
+              <w:t>{fix_hours</w:t>
+            </w:r>
+            <w:r>
+              <w:rPr>
+                <w:rFonts w:hint="eastAsia"/>
                 <w:sz w:val="20"/>
                 <w:szCs w:val="20"/>
               </w:rPr>
@@ -1410,7 +1276,6 @@
             </w:r>
             <w:r>
               <w:rPr>
-                <w:rFonts w:hint="eastAsia"/>
                 <w:sz w:val="20"/>
                 <w:szCs w:val="20"/>
               </w:rPr>
@@ -1420,29 +1285,29 @@
         </w:tc>
         <w:tc>
           <w:tcPr>
-            <w:tcW w:w="1620" w:type="dxa"/>
-          </w:tcPr>
-          <w:p>
-            <w:pPr>
-              <w:jc w:val="center"/>
-              <w:rPr>
-                <w:sz w:val="20"/>
-                <w:szCs w:val="20"/>
-              </w:rPr>
-            </w:pPr>
-            <w:r>
-              <w:rPr>
-                <w:rFonts w:hint="eastAsia"/>
-                <w:sz w:val="20"/>
-                <w:szCs w:val="20"/>
-              </w:rPr>
-              <w:t>总工时</w:t>
-            </w:r>
-          </w:p>
-        </w:tc>
-        <w:tc>
-          <w:tcPr>
-            <w:tcW w:w="1620" w:type="dxa"/>
+            <w:tcW w:w="1710" w:type="dxa"/>
+          </w:tcPr>
+          <w:p>
+            <w:pPr>
+              <w:jc w:val="center"/>
+              <w:rPr>
+                <w:sz w:val="20"/>
+                <w:szCs w:val="20"/>
+              </w:rPr>
+            </w:pPr>
+            <w:r>
+              <w:rPr>
+                <w:rFonts w:hint="eastAsia"/>
+                <w:sz w:val="20"/>
+                <w:szCs w:val="20"/>
+              </w:rPr>
+              <w:t>总费用（元）</w:t>
+            </w:r>
+          </w:p>
+        </w:tc>
+        <w:tc>
+          <w:tcPr>
+            <w:tcW w:w="2070" w:type="dxa"/>
           </w:tcPr>
           <w:p>
             <w:pPr>
@@ -1466,81 +1331,6 @@
               </w:rPr>
               <w:t>{</w:t>
             </w:r>
-            <w:proofErr w:type="spellStart"/>
-            <w:r>
-              <w:rPr>
-                <w:sz w:val="20"/>
-                <w:szCs w:val="20"/>
-              </w:rPr>
-              <w:t>fix_hours</w:t>
-            </w:r>
-            <w:proofErr w:type="spellEnd"/>
-            <w:r>
-              <w:rPr>
-                <w:rFonts w:hint="eastAsia"/>
-                <w:sz w:val="20"/>
-                <w:szCs w:val="20"/>
-              </w:rPr>
-              <w:t>}</w:t>
-            </w:r>
-            <w:r>
-              <w:rPr>
-                <w:sz w:val="20"/>
-                <w:szCs w:val="20"/>
-              </w:rPr>
-              <w:t>}</w:t>
-            </w:r>
-          </w:p>
-        </w:tc>
-        <w:tc>
-          <w:tcPr>
-            <w:tcW w:w="1710" w:type="dxa"/>
-          </w:tcPr>
-          <w:p>
-            <w:pPr>
-              <w:jc w:val="center"/>
-              <w:rPr>
-                <w:sz w:val="20"/>
-                <w:szCs w:val="20"/>
-              </w:rPr>
-            </w:pPr>
-            <w:r>
-              <w:rPr>
-                <w:rFonts w:hint="eastAsia"/>
-                <w:sz w:val="20"/>
-                <w:szCs w:val="20"/>
-              </w:rPr>
-              <w:t>总费用（元）</w:t>
-            </w:r>
-          </w:p>
-        </w:tc>
-        <w:tc>
-          <w:tcPr>
-            <w:tcW w:w="2070" w:type="dxa"/>
-          </w:tcPr>
-          <w:p>
-            <w:pPr>
-              <w:jc w:val="center"/>
-              <w:rPr>
-                <w:sz w:val="20"/>
-                <w:szCs w:val="20"/>
-              </w:rPr>
-            </w:pPr>
-            <w:r>
-              <w:rPr>
-                <w:sz w:val="20"/>
-                <w:szCs w:val="20"/>
-              </w:rPr>
-              <w:t>{</w:t>
-            </w:r>
-            <w:r>
-              <w:rPr>
-                <w:sz w:val="20"/>
-                <w:szCs w:val="20"/>
-              </w:rPr>
-              <w:t>{</w:t>
-            </w:r>
-            <w:proofErr w:type="spellStart"/>
             <w:r>
               <w:rPr>
                 <w:sz w:val="20"/>
@@ -1548,7 +1338,6 @@
               </w:rPr>
               <w:t>fix_fee</w:t>
             </w:r>
-            <w:proofErr w:type="spellEnd"/>
             <w:r>
               <w:rPr>
                 <w:rFonts w:hint="eastAsia"/>
@@ -1608,90 +1397,80 @@
                 <w:sz w:val="20"/>
                 <w:szCs w:val="20"/>
               </w:rPr>
+              <w:t>{{fix_</w:t>
+            </w:r>
+            <w:r>
+              <w:rPr>
+                <w:sz w:val="20"/>
+                <w:szCs w:val="20"/>
+              </w:rPr>
+              <w:t>other_</w:t>
+            </w:r>
+            <w:r>
+              <w:rPr>
+                <w:sz w:val="20"/>
+                <w:szCs w:val="20"/>
+              </w:rPr>
+              <w:t>fee</w:t>
+            </w:r>
+            <w:r>
+              <w:rPr>
+                <w:rFonts w:hint="eastAsia"/>
+                <w:sz w:val="20"/>
+                <w:szCs w:val="20"/>
+              </w:rPr>
+              <w:t>}</w:t>
+            </w:r>
+            <w:r>
+              <w:rPr>
+                <w:sz w:val="20"/>
+                <w:szCs w:val="20"/>
+              </w:rPr>
+              <w:t>}</w:t>
+            </w:r>
+          </w:p>
+        </w:tc>
+        <w:tc>
+          <w:tcPr>
+            <w:tcW w:w="1620" w:type="dxa"/>
+          </w:tcPr>
+          <w:p>
+            <w:pPr>
+              <w:jc w:val="center"/>
+              <w:rPr>
+                <w:sz w:val="20"/>
+                <w:szCs w:val="20"/>
+              </w:rPr>
+            </w:pPr>
+            <w:r>
+              <w:rPr>
+                <w:rFonts w:hint="eastAsia"/>
+                <w:sz w:val="20"/>
+                <w:szCs w:val="20"/>
+              </w:rPr>
+              <w:t>外修费用</w:t>
+            </w:r>
+          </w:p>
+        </w:tc>
+        <w:tc>
+          <w:tcPr>
+            <w:tcW w:w="1620" w:type="dxa"/>
+          </w:tcPr>
+          <w:p>
+            <w:pPr>
+              <w:jc w:val="center"/>
+              <w:rPr>
+                <w:sz w:val="20"/>
+                <w:szCs w:val="20"/>
+              </w:rPr>
+            </w:pPr>
+            <w:r>
+              <w:rPr>
+                <w:sz w:val="20"/>
+                <w:szCs w:val="20"/>
+              </w:rPr>
               <w:t>{{</w:t>
             </w:r>
-            <w:proofErr w:type="spellStart"/>
-            <w:r>
-              <w:rPr>
-                <w:sz w:val="20"/>
-                <w:szCs w:val="20"/>
-              </w:rPr>
-              <w:t>fix_</w:t>
-            </w:r>
-            <w:r>
-              <w:rPr>
-                <w:sz w:val="20"/>
-                <w:szCs w:val="20"/>
-              </w:rPr>
-              <w:t>other_</w:t>
-            </w:r>
-            <w:r>
-              <w:rPr>
-                <w:sz w:val="20"/>
-                <w:szCs w:val="20"/>
-              </w:rPr>
-              <w:t>fee</w:t>
-            </w:r>
-            <w:proofErr w:type="spellEnd"/>
-            <w:r>
-              <w:rPr>
-                <w:rFonts w:hint="eastAsia"/>
-                <w:sz w:val="20"/>
-                <w:szCs w:val="20"/>
-              </w:rPr>
-              <w:t>}</w:t>
-            </w:r>
-            <w:r>
-              <w:rPr>
-                <w:sz w:val="20"/>
-                <w:szCs w:val="20"/>
-              </w:rPr>
-              <w:t>}</w:t>
-            </w:r>
-          </w:p>
-        </w:tc>
-        <w:tc>
-          <w:tcPr>
-            <w:tcW w:w="1620" w:type="dxa"/>
-          </w:tcPr>
-          <w:p>
-            <w:pPr>
-              <w:jc w:val="center"/>
-              <w:rPr>
-                <w:sz w:val="20"/>
-                <w:szCs w:val="20"/>
-              </w:rPr>
-            </w:pPr>
-            <w:r>
-              <w:rPr>
-                <w:rFonts w:hint="eastAsia"/>
-                <w:sz w:val="20"/>
-                <w:szCs w:val="20"/>
-              </w:rPr>
-              <w:t>外修费用</w:t>
-            </w:r>
-          </w:p>
-        </w:tc>
-        <w:tc>
-          <w:tcPr>
-            <w:tcW w:w="1620" w:type="dxa"/>
-          </w:tcPr>
-          <w:p>
-            <w:pPr>
-              <w:jc w:val="center"/>
-              <w:rPr>
-                <w:sz w:val="20"/>
-                <w:szCs w:val="20"/>
-              </w:rPr>
-            </w:pPr>
-            <w:r>
-              <w:rPr>
-                <w:sz w:val="20"/>
-                <w:szCs w:val="20"/>
-              </w:rPr>
-              <w:t>{{</w:t>
-            </w:r>
-            <w:proofErr w:type="spellStart"/>
             <w:r>
               <w:rPr>
                 <w:sz w:val="20"/>
@@ -1699,7 +1478,6 @@
               </w:rPr>
               <w:t>fix_ext_fee</w:t>
             </w:r>
-            <w:proofErr w:type="spellEnd"/>
             <w:r>
               <w:rPr>
                 <w:sz w:val="20"/>
@@ -1789,7 +1567,6 @@
               </w:rPr>
               <w:t>{</w:t>
             </w:r>
-            <w:proofErr w:type="spellStart"/>
             <w:r>
               <w:rPr>
                 <w:sz w:val="20"/>
@@ -1811,7 +1588,6 @@
               </w:rPr>
               <w:t>time</w:t>
             </w:r>
-            <w:proofErr w:type="spellEnd"/>
             <w:r>
               <w:rPr>
                 <w:rFonts w:hint="eastAsia"/>
@@ -1876,68 +1652,66 @@
                 <w:sz w:val="20"/>
                 <w:szCs w:val="20"/>
               </w:rPr>
+              <w:t>{fix_type</w:t>
+            </w:r>
+            <w:r>
+              <w:rPr>
+                <w:rFonts w:hint="eastAsia"/>
+                <w:sz w:val="20"/>
+                <w:szCs w:val="20"/>
+              </w:rPr>
+              <w:t>}</w:t>
+            </w:r>
+            <w:r>
+              <w:rPr>
+                <w:sz w:val="20"/>
+                <w:szCs w:val="20"/>
+              </w:rPr>
+              <w:t>}</w:t>
+            </w:r>
+          </w:p>
+        </w:tc>
+        <w:tc>
+          <w:tcPr>
+            <w:tcW w:w="1710" w:type="dxa"/>
+          </w:tcPr>
+          <w:p>
+            <w:pPr>
+              <w:jc w:val="center"/>
+              <w:rPr>
+                <w:sz w:val="20"/>
+                <w:szCs w:val="20"/>
+              </w:rPr>
+            </w:pPr>
+            <w:r>
+              <w:rPr>
+                <w:rFonts w:hint="eastAsia"/>
+                <w:sz w:val="20"/>
+                <w:szCs w:val="20"/>
+              </w:rPr>
+              <w:t>故障类型</w:t>
+            </w:r>
+          </w:p>
+        </w:tc>
+        <w:tc>
+          <w:tcPr>
+            <w:tcW w:w="2070" w:type="dxa"/>
+          </w:tcPr>
+          <w:p>
+            <w:pPr>
+              <w:jc w:val="center"/>
+              <w:rPr>
+                <w:sz w:val="20"/>
+                <w:szCs w:val="20"/>
+              </w:rPr>
+            </w:pPr>
+            <w:r>
+              <w:rPr>
+                <w:sz w:val="20"/>
+                <w:szCs w:val="20"/>
+              </w:rPr>
               <w:t>{</w:t>
             </w:r>
-            <w:proofErr w:type="spellStart"/>
-            <w:r>
-              <w:rPr>
-                <w:sz w:val="20"/>
-                <w:szCs w:val="20"/>
-              </w:rPr>
-              <w:t>fix_type</w:t>
-            </w:r>
-            <w:proofErr w:type="spellEnd"/>
-            <w:r>
-              <w:rPr>
-                <w:rFonts w:hint="eastAsia"/>
-                <w:sz w:val="20"/>
-                <w:szCs w:val="20"/>
-              </w:rPr>
-              <w:t>}</w:t>
-            </w:r>
-            <w:r>
-              <w:rPr>
-                <w:sz w:val="20"/>
-                <w:szCs w:val="20"/>
-              </w:rPr>
-              <w:t>}</w:t>
-            </w:r>
-          </w:p>
-        </w:tc>
-        <w:tc>
-          <w:tcPr>
-            <w:tcW w:w="1710" w:type="dxa"/>
-          </w:tcPr>
-          <w:p>
-            <w:pPr>
-              <w:jc w:val="center"/>
-              <w:rPr>
-                <w:sz w:val="20"/>
-                <w:szCs w:val="20"/>
-              </w:rPr>
-            </w:pPr>
-            <w:r>
-              <w:rPr>
-                <w:rFonts w:hint="eastAsia"/>
-                <w:sz w:val="20"/>
-                <w:szCs w:val="20"/>
-              </w:rPr>
-              <w:t>故障类型</w:t>
-            </w:r>
-          </w:p>
-        </w:tc>
-        <w:tc>
-          <w:tcPr>
-            <w:tcW w:w="2070" w:type="dxa"/>
-          </w:tcPr>
-          <w:p>
-            <w:pPr>
-              <w:jc w:val="center"/>
-              <w:rPr>
-                <w:sz w:val="20"/>
-                <w:szCs w:val="20"/>
-              </w:rPr>
-            </w:pPr>
             <w:r>
               <w:rPr>
                 <w:sz w:val="20"/>
@@ -1950,17 +1724,8 @@
                 <w:sz w:val="20"/>
                 <w:szCs w:val="20"/>
               </w:rPr>
-              <w:t>{</w:t>
-            </w:r>
-            <w:proofErr w:type="spellStart"/>
-            <w:r>
-              <w:rPr>
-                <w:sz w:val="20"/>
-                <w:szCs w:val="20"/>
-              </w:rPr>
               <w:t>fix_error_type</w:t>
             </w:r>
-            <w:proofErr w:type="spellEnd"/>
             <w:r>
               <w:rPr>
                 <w:sz w:val="20"/>
@@ -2029,7 +1794,6 @@
               </w:rPr>
               <w:t>{</w:t>
             </w:r>
-            <w:proofErr w:type="spellStart"/>
             <w:r>
               <w:rPr>
                 <w:sz w:val="20"/>
@@ -2037,7 +1801,6 @@
               </w:rPr>
               <w:t>fix_owner</w:t>
             </w:r>
-            <w:proofErr w:type="spellEnd"/>
             <w:r>
               <w:rPr>
                 <w:rFonts w:hint="eastAsia"/>
@@ -2092,7 +1855,6 @@
               </w:rPr>
               <w:t>{</w:t>
             </w:r>
-            <w:proofErr w:type="spellStart"/>
             <w:r>
               <w:rPr>
                 <w:sz w:val="20"/>
@@ -2100,7 +1862,6 @@
               </w:rPr>
               <w:t>fix_man_hour</w:t>
             </w:r>
-            <w:proofErr w:type="spellEnd"/>
             <w:r>
               <w:rPr>
                 <w:sz w:val="20"/>
@@ -2431,23 +2192,7 @@
                 <w:sz w:val="20"/>
                 <w:szCs w:val="20"/>
               </w:rPr>
-              <w:t>{</w:t>
-            </w:r>
-            <w:proofErr w:type="spellStart"/>
-            <w:r>
-              <w:rPr>
-                <w:sz w:val="20"/>
-                <w:szCs w:val="20"/>
-              </w:rPr>
-              <w:t>fix_reason</w:t>
-            </w:r>
-            <w:proofErr w:type="spellEnd"/>
-            <w:r>
-              <w:rPr>
-                <w:sz w:val="20"/>
-                <w:szCs w:val="20"/>
-              </w:rPr>
-              <w:t>}</w:t>
+              <w:t>{fix_reason}</w:t>
             </w:r>
             <w:r>
               <w:rPr>
@@ -2480,7 +2225,6 @@
               </w:rPr>
               <w:t>{{</w:t>
             </w:r>
-            <w:proofErr w:type="spellStart"/>
             <w:r>
               <w:rPr>
                 <w:sz w:val="20"/>
@@ -2488,7 +2232,6 @@
               </w:rPr>
               <w:t>fix_solution</w:t>
             </w:r>
-            <w:proofErr w:type="spellEnd"/>
             <w:r>
               <w:rPr>
                 <w:rFonts w:hint="eastAsia"/>
@@ -2525,23 +2268,7 @@
                 <w:sz w:val="20"/>
                 <w:szCs w:val="20"/>
               </w:rPr>
-              <w:t>{</w:t>
-            </w:r>
-            <w:proofErr w:type="spellStart"/>
-            <w:r>
-              <w:rPr>
-                <w:sz w:val="20"/>
-                <w:szCs w:val="20"/>
-              </w:rPr>
-              <w:t>fix_validation</w:t>
-            </w:r>
-            <w:proofErr w:type="spellEnd"/>
-            <w:r>
-              <w:rPr>
-                <w:sz w:val="20"/>
-                <w:szCs w:val="20"/>
-              </w:rPr>
-              <w:t>}</w:t>
+              <w:t>{fix_validation}</w:t>
             </w:r>
             <w:r>
               <w:rPr>
@@ -2753,7 +2480,6 @@
             <w:r>
               <w:t>{</w:t>
             </w:r>
-            <w:proofErr w:type="spellStart"/>
             <w:r>
               <w:rPr>
                 <w:rFonts w:hint="eastAsia"/>
@@ -2763,7 +2489,6 @@
             <w:r>
               <w:t>_table</w:t>
             </w:r>
-            <w:proofErr w:type="spellEnd"/>
             <w:r>
               <w:t>}</w:t>
             </w:r>
@@ -2933,7 +2658,6 @@
             <w:r>
               <w:t>{</w:t>
             </w:r>
-            <w:proofErr w:type="spellStart"/>
             <w:r>
               <w:rPr>
                 <w:rFonts w:hint="eastAsia"/>
@@ -2952,7 +2676,6 @@
             <w:r>
               <w:t>_table</w:t>
             </w:r>
-            <w:proofErr w:type="spellEnd"/>
             <w:r>
               <w:t>}</w:t>
             </w:r>
@@ -3080,11 +2803,9 @@
             <w:r>
               <w:t>{</w:t>
             </w:r>
-            <w:proofErr w:type="spellStart"/>
             <w:r>
               <w:t>audit_table</w:t>
             </w:r>
-            <w:proofErr w:type="spellEnd"/>
             <w:r>
               <w:t>}</w:t>
             </w:r>
@@ -3102,8 +2823,6 @@
       <w:pPr>
         <w:jc w:val="center"/>
       </w:pPr>
-      <w:bookmarkStart w:id="0" w:name="_GoBack"/>
-      <w:bookmarkEnd w:id="0"/>
     </w:p>
     <w:p>
       <w:pPr>
@@ -3116,12 +2835,17 @@
         <w:t>验收人签名</w:t>
       </w:r>
       <w:r>
-        <w:t>: {{</w:t>
+        <w:rPr>
+          <w:rFonts w:hint="eastAsia"/>
+        </w:rPr>
+        <w:t>：</w:t>
+      </w:r>
+      <w:r>
+        <w:t xml:space="preserve"> {{</w:t>
       </w:r>
       <w:r>
         <w:t>@</w:t>
       </w:r>
-      <w:proofErr w:type="spellStart"/>
       <w:r>
         <w:t>ack</w:t>
       </w:r>
@@ -3131,18 +2855,15 @@
       <w:r>
         <w:t>ignature</w:t>
       </w:r>
-      <w:proofErr w:type="spellEnd"/>
       <w:r>
         <w:t>}}</w:t>
       </w:r>
       <w:r>
         <w:t>{{</w:t>
       </w:r>
-      <w:proofErr w:type="spellStart"/>
       <w:r>
         <w:t>ack_signature_space</w:t>
       </w:r>
-      <w:proofErr w:type="spellEnd"/>
       <w:r>
         <w:t>}}</w:t>
       </w:r>
@@ -3159,6 +2880,14 @@
         <w:t>审核人签名：</w:t>
       </w:r>
       <w:r>
+        <w:rPr>
+          <w:rFonts w:hint="eastAsia"/>
+        </w:rPr>
+        <w:t xml:space="preserve"> </w:t>
+      </w:r>
+      <w:bookmarkStart w:id="0" w:name="_GoBack"/>
+      <w:bookmarkEnd w:id="0"/>
+      <w:r>
         <w:t>{{</w:t>
       </w:r>
       <w:r>
@@ -3170,11 +2899,9 @@
       <w:r>
         <w:t>{{</w:t>
       </w:r>
-      <w:proofErr w:type="spellStart"/>
       <w:r>
         <w:t>signature_space</w:t>
       </w:r>
-      <w:proofErr w:type="spellEnd"/>
       <w:r>
         <w:t>}}</w:t>
       </w:r>
@@ -3936,7 +3663,7 @@
 </file>
 
 <file path=customXml/itemProps1.xml><?xml version="1.0" encoding="utf-8"?>
-<ds:datastoreItem xmlns:ds="http://schemas.openxmlformats.org/officeDocument/2006/customXml" ds:itemID="{C548C70B-EEC4-47CD-8D06-9C3022958D02}">
+<ds:datastoreItem xmlns:ds="http://schemas.openxmlformats.org/officeDocument/2006/customXml" ds:itemID="{834F5F7A-A99C-472C-9CCA-87F9990DD878}">
   <ds:schemaRefs>
     <ds:schemaRef ds:uri="http://schemas.openxmlformats.org/officeDocument/2006/bibliography"/>
   </ds:schemaRefs>

</xml_diff>

<commit_message>
YHAAO-2423 Reverse sign order
</commit_message>
<xml_diff>
--- a/src/src/main/webapp/portal/wo/woExportTemplate/template.docx
+++ b/src/src/main/webapp/portal/wo/woExportTemplate/template.docx
@@ -197,6 +197,7 @@
               </w:rPr>
               <w:t>{{</w:t>
             </w:r>
+            <w:proofErr w:type="spellStart"/>
             <w:r>
               <w:rPr>
                 <w:rFonts w:hint="eastAsia"/>
@@ -205,6 +206,7 @@
               </w:rPr>
               <w:t>device_name</w:t>
             </w:r>
+            <w:proofErr w:type="spellEnd"/>
             <w:r>
               <w:rPr>
                 <w:sz w:val="20"/>
@@ -260,7 +262,23 @@
                 <w:sz w:val="20"/>
                 <w:szCs w:val="20"/>
               </w:rPr>
-              <w:t>{{device_department}}</w:t>
+              <w:t>{{</w:t>
+            </w:r>
+            <w:proofErr w:type="spellStart"/>
+            <w:r>
+              <w:rPr>
+                <w:sz w:val="20"/>
+                <w:szCs w:val="20"/>
+              </w:rPr>
+              <w:t>device_department</w:t>
+            </w:r>
+            <w:proofErr w:type="spellEnd"/>
+            <w:r>
+              <w:rPr>
+                <w:sz w:val="20"/>
+                <w:szCs w:val="20"/>
+              </w:rPr>
+              <w:t>}}</w:t>
             </w:r>
           </w:p>
         </w:tc>
@@ -314,6 +332,7 @@
               </w:rPr>
               <w:t>{{</w:t>
             </w:r>
+            <w:proofErr w:type="spellStart"/>
             <w:r>
               <w:rPr>
                 <w:sz w:val="20"/>
@@ -321,6 +340,7 @@
               </w:rPr>
               <w:t>device_type</w:t>
             </w:r>
+            <w:proofErr w:type="spellEnd"/>
             <w:r>
               <w:rPr>
                 <w:sz w:val="20"/>
@@ -376,7 +396,23 @@
                 <w:sz w:val="20"/>
                 <w:szCs w:val="20"/>
               </w:rPr>
-              <w:t>{{device_oem}}</w:t>
+              <w:t>{{</w:t>
+            </w:r>
+            <w:proofErr w:type="spellStart"/>
+            <w:r>
+              <w:rPr>
+                <w:sz w:val="20"/>
+                <w:szCs w:val="20"/>
+              </w:rPr>
+              <w:t>device_oem</w:t>
+            </w:r>
+            <w:proofErr w:type="spellEnd"/>
+            <w:r>
+              <w:rPr>
+                <w:sz w:val="20"/>
+                <w:szCs w:val="20"/>
+              </w:rPr>
+              <w:t>}}</w:t>
             </w:r>
           </w:p>
         </w:tc>
@@ -422,6 +458,7 @@
               </w:rPr>
               <w:t>{{</w:t>
             </w:r>
+            <w:proofErr w:type="spellStart"/>
             <w:r>
               <w:rPr>
                 <w:sz w:val="20"/>
@@ -429,6 +466,7 @@
               </w:rPr>
               <w:t>device_serial</w:t>
             </w:r>
+            <w:proofErr w:type="spellEnd"/>
             <w:r>
               <w:rPr>
                 <w:sz w:val="20"/>
@@ -484,7 +522,23 @@
                 <w:sz w:val="20"/>
                 <w:szCs w:val="20"/>
               </w:rPr>
-              <w:t>{{device_number}}</w:t>
+              <w:t>{{</w:t>
+            </w:r>
+            <w:proofErr w:type="spellStart"/>
+            <w:r>
+              <w:rPr>
+                <w:sz w:val="20"/>
+                <w:szCs w:val="20"/>
+              </w:rPr>
+              <w:t>device_number</w:t>
+            </w:r>
+            <w:proofErr w:type="spellEnd"/>
+            <w:r>
+              <w:rPr>
+                <w:sz w:val="20"/>
+                <w:szCs w:val="20"/>
+              </w:rPr>
+              <w:t>}}</w:t>
             </w:r>
           </w:p>
         </w:tc>
@@ -538,6 +592,7 @@
               </w:rPr>
               <w:t>{{</w:t>
             </w:r>
+            <w:proofErr w:type="spellStart"/>
             <w:r>
               <w:rPr>
                 <w:sz w:val="20"/>
@@ -545,6 +600,7 @@
               </w:rPr>
               <w:t>device_qr</w:t>
             </w:r>
+            <w:proofErr w:type="spellEnd"/>
             <w:r>
               <w:rPr>
                 <w:sz w:val="20"/>
@@ -600,7 +656,23 @@
                 <w:sz w:val="20"/>
                 <w:szCs w:val="20"/>
               </w:rPr>
-              <w:t>{{device_location}}</w:t>
+              <w:t>{{</w:t>
+            </w:r>
+            <w:proofErr w:type="spellStart"/>
+            <w:r>
+              <w:rPr>
+                <w:sz w:val="20"/>
+                <w:szCs w:val="20"/>
+              </w:rPr>
+              <w:t>device_location</w:t>
+            </w:r>
+            <w:proofErr w:type="spellEnd"/>
+            <w:r>
+              <w:rPr>
+                <w:sz w:val="20"/>
+                <w:szCs w:val="20"/>
+              </w:rPr>
+              <w:t>}}</w:t>
             </w:r>
           </w:p>
         </w:tc>
@@ -706,7 +778,23 @@
                 <w:sz w:val="20"/>
                 <w:szCs w:val="20"/>
               </w:rPr>
-              <w:t>{{issue_number}}</w:t>
+              <w:t>{{</w:t>
+            </w:r>
+            <w:proofErr w:type="spellStart"/>
+            <w:r>
+              <w:rPr>
+                <w:sz w:val="20"/>
+                <w:szCs w:val="20"/>
+              </w:rPr>
+              <w:t>issue_number</w:t>
+            </w:r>
+            <w:proofErr w:type="spellEnd"/>
+            <w:r>
+              <w:rPr>
+                <w:sz w:val="20"/>
+                <w:szCs w:val="20"/>
+              </w:rPr>
+              <w:t>}}</w:t>
             </w:r>
           </w:p>
         </w:tc>
@@ -750,7 +838,23 @@
                 <w:sz w:val="20"/>
                 <w:szCs w:val="20"/>
               </w:rPr>
-              <w:t>{issue_desc}</w:t>
+              <w:t>{</w:t>
+            </w:r>
+            <w:proofErr w:type="spellStart"/>
+            <w:r>
+              <w:rPr>
+                <w:sz w:val="20"/>
+                <w:szCs w:val="20"/>
+              </w:rPr>
+              <w:t>issue_desc</w:t>
+            </w:r>
+            <w:proofErr w:type="spellEnd"/>
+            <w:r>
+              <w:rPr>
+                <w:sz w:val="20"/>
+                <w:szCs w:val="20"/>
+              </w:rPr>
+              <w:t>}</w:t>
             </w:r>
             <w:r>
               <w:rPr>
@@ -838,7 +942,23 @@
                 <w:sz w:val="20"/>
                 <w:szCs w:val="20"/>
               </w:rPr>
-              <w:t>{{issue_reporter}}</w:t>
+              <w:t>{{</w:t>
+            </w:r>
+            <w:proofErr w:type="spellStart"/>
+            <w:r>
+              <w:rPr>
+                <w:sz w:val="20"/>
+                <w:szCs w:val="20"/>
+              </w:rPr>
+              <w:t>issue_reporter</w:t>
+            </w:r>
+            <w:proofErr w:type="spellEnd"/>
+            <w:r>
+              <w:rPr>
+                <w:sz w:val="20"/>
+                <w:szCs w:val="20"/>
+              </w:rPr>
+              <w:t>}}</w:t>
             </w:r>
           </w:p>
         </w:tc>
@@ -901,7 +1021,23 @@
                 <w:sz w:val="20"/>
                 <w:szCs w:val="20"/>
               </w:rPr>
-              <w:t>{{issue_reporter_phone}}</w:t>
+              <w:t>{{</w:t>
+            </w:r>
+            <w:proofErr w:type="spellStart"/>
+            <w:r>
+              <w:rPr>
+                <w:sz w:val="20"/>
+                <w:szCs w:val="20"/>
+              </w:rPr>
+              <w:t>issue_reporter_phone</w:t>
+            </w:r>
+            <w:proofErr w:type="spellEnd"/>
+            <w:r>
+              <w:rPr>
+                <w:sz w:val="20"/>
+                <w:szCs w:val="20"/>
+              </w:rPr>
+              <w:t>}}</w:t>
             </w:r>
           </w:p>
         </w:tc>
@@ -964,14 +1100,30 @@
                 <w:sz w:val="20"/>
                 <w:szCs w:val="20"/>
               </w:rPr>
-              <w:t>{{issue_report</w:t>
-            </w:r>
-            <w:r>
-              <w:rPr>
-                <w:sz w:val="20"/>
-                <w:szCs w:val="20"/>
-              </w:rPr>
-              <w:t>_time}}</w:t>
+              <w:t>{{</w:t>
+            </w:r>
+            <w:proofErr w:type="spellStart"/>
+            <w:r>
+              <w:rPr>
+                <w:sz w:val="20"/>
+                <w:szCs w:val="20"/>
+              </w:rPr>
+              <w:t>issue_report</w:t>
+            </w:r>
+            <w:r>
+              <w:rPr>
+                <w:sz w:val="20"/>
+                <w:szCs w:val="20"/>
+              </w:rPr>
+              <w:t>_time</w:t>
+            </w:r>
+            <w:proofErr w:type="spellEnd"/>
+            <w:r>
+              <w:rPr>
+                <w:sz w:val="20"/>
+                <w:szCs w:val="20"/>
+              </w:rPr>
+              <w:t>}}</w:t>
             </w:r>
           </w:p>
         </w:tc>
@@ -1034,7 +1186,23 @@
                 <w:sz w:val="20"/>
                 <w:szCs w:val="20"/>
               </w:rPr>
-              <w:t>{{issue_report_status}}</w:t>
+              <w:t>{{</w:t>
+            </w:r>
+            <w:proofErr w:type="spellStart"/>
+            <w:r>
+              <w:rPr>
+                <w:sz w:val="20"/>
+                <w:szCs w:val="20"/>
+              </w:rPr>
+              <w:t>issue_report_status</w:t>
+            </w:r>
+            <w:proofErr w:type="spellEnd"/>
+            <w:r>
+              <w:rPr>
+                <w:sz w:val="20"/>
+                <w:szCs w:val="20"/>
+              </w:rPr>
+              <w:t>}}</w:t>
             </w:r>
           </w:p>
         </w:tc>
@@ -1097,7 +1265,23 @@
                 <w:sz w:val="20"/>
                 <w:szCs w:val="20"/>
               </w:rPr>
-              <w:t>{{issue_device_stop_time}}</w:t>
+              <w:t>{{</w:t>
+            </w:r>
+            <w:proofErr w:type="spellStart"/>
+            <w:r>
+              <w:rPr>
+                <w:sz w:val="20"/>
+                <w:szCs w:val="20"/>
+              </w:rPr>
+              <w:t>issue_device_stop_time</w:t>
+            </w:r>
+            <w:proofErr w:type="spellEnd"/>
+            <w:r>
+              <w:rPr>
+                <w:sz w:val="20"/>
+                <w:szCs w:val="20"/>
+              </w:rPr>
+              <w:t>}}</w:t>
             </w:r>
           </w:p>
         </w:tc>
@@ -1206,16 +1390,32 @@
                 <w:sz w:val="20"/>
                 <w:szCs w:val="20"/>
               </w:rPr>
-              <w:t>{fix_status}</w:t>
-            </w:r>
-            <w:r>
-              <w:rPr>
-                <w:rFonts w:hint="eastAsia"/>
+              <w:t>{</w:t>
+            </w:r>
+            <w:proofErr w:type="spellStart"/>
+            <w:r>
+              <w:rPr>
+                <w:sz w:val="20"/>
+                <w:szCs w:val="20"/>
+              </w:rPr>
+              <w:t>fix_status</w:t>
+            </w:r>
+            <w:proofErr w:type="spellEnd"/>
+            <w:r>
+              <w:rPr>
                 <w:sz w:val="20"/>
                 <w:szCs w:val="20"/>
               </w:rPr>
               <w:t>}</w:t>
             </w:r>
+            <w:r>
+              <w:rPr>
+                <w:rFonts w:hint="eastAsia"/>
+                <w:sz w:val="20"/>
+                <w:szCs w:val="20"/>
+              </w:rPr>
+              <w:t>}</w:t>
+            </w:r>
           </w:p>
         </w:tc>
         <w:tc>
@@ -1264,8 +1464,17 @@
                 <w:sz w:val="20"/>
                 <w:szCs w:val="20"/>
               </w:rPr>
-              <w:t>{fix_hours</w:t>
-            </w:r>
+              <w:t>{</w:t>
+            </w:r>
+            <w:proofErr w:type="spellStart"/>
+            <w:r>
+              <w:rPr>
+                <w:sz w:val="20"/>
+                <w:szCs w:val="20"/>
+              </w:rPr>
+              <w:t>fix_hours</w:t>
+            </w:r>
+            <w:proofErr w:type="spellEnd"/>
             <w:r>
               <w:rPr>
                 <w:rFonts w:hint="eastAsia"/>
@@ -1331,6 +1540,7 @@
               </w:rPr>
               <w:t>{</w:t>
             </w:r>
+            <w:proofErr w:type="spellStart"/>
             <w:r>
               <w:rPr>
                 <w:sz w:val="20"/>
@@ -1338,6 +1548,7 @@
               </w:rPr>
               <w:t>fix_fee</w:t>
             </w:r>
+            <w:proofErr w:type="spellEnd"/>
             <w:r>
               <w:rPr>
                 <w:rFonts w:hint="eastAsia"/>
@@ -1397,7 +1608,15 @@
                 <w:sz w:val="20"/>
                 <w:szCs w:val="20"/>
               </w:rPr>
-              <w:t>{{fix_</w:t>
+              <w:t>{{</w:t>
+            </w:r>
+            <w:proofErr w:type="spellStart"/>
+            <w:r>
+              <w:rPr>
+                <w:sz w:val="20"/>
+                <w:szCs w:val="20"/>
+              </w:rPr>
+              <w:t>fix_</w:t>
             </w:r>
             <w:r>
               <w:rPr>
@@ -1413,6 +1632,7 @@
               </w:rPr>
               <w:t>fee</w:t>
             </w:r>
+            <w:proofErr w:type="spellEnd"/>
             <w:r>
               <w:rPr>
                 <w:rFonts w:hint="eastAsia"/>
@@ -1471,6 +1691,7 @@
               </w:rPr>
               <w:t>{{</w:t>
             </w:r>
+            <w:proofErr w:type="spellStart"/>
             <w:r>
               <w:rPr>
                 <w:sz w:val="20"/>
@@ -1478,6 +1699,7 @@
               </w:rPr>
               <w:t>fix_ext_fee</w:t>
             </w:r>
+            <w:proofErr w:type="spellEnd"/>
             <w:r>
               <w:rPr>
                 <w:sz w:val="20"/>
@@ -1567,6 +1789,7 @@
               </w:rPr>
               <w:t>{</w:t>
             </w:r>
+            <w:proofErr w:type="spellStart"/>
             <w:r>
               <w:rPr>
                 <w:sz w:val="20"/>
@@ -1588,6 +1811,7 @@
               </w:rPr>
               <w:t>time</w:t>
             </w:r>
+            <w:proofErr w:type="spellEnd"/>
             <w:r>
               <w:rPr>
                 <w:rFonts w:hint="eastAsia"/>
@@ -1652,8 +1876,17 @@
                 <w:sz w:val="20"/>
                 <w:szCs w:val="20"/>
               </w:rPr>
-              <w:t>{fix_type</w:t>
-            </w:r>
+              <w:t>{</w:t>
+            </w:r>
+            <w:proofErr w:type="spellStart"/>
+            <w:r>
+              <w:rPr>
+                <w:sz w:val="20"/>
+                <w:szCs w:val="20"/>
+              </w:rPr>
+              <w:t>fix_type</w:t>
+            </w:r>
+            <w:proofErr w:type="spellEnd"/>
             <w:r>
               <w:rPr>
                 <w:rFonts w:hint="eastAsia"/>
@@ -1719,6 +1952,7 @@
               </w:rPr>
               <w:t>{</w:t>
             </w:r>
+            <w:proofErr w:type="spellStart"/>
             <w:r>
               <w:rPr>
                 <w:sz w:val="20"/>
@@ -1726,6 +1960,7 @@
               </w:rPr>
               <w:t>fix_error_type</w:t>
             </w:r>
+            <w:proofErr w:type="spellEnd"/>
             <w:r>
               <w:rPr>
                 <w:sz w:val="20"/>
@@ -1794,6 +2029,7 @@
               </w:rPr>
               <w:t>{</w:t>
             </w:r>
+            <w:proofErr w:type="spellStart"/>
             <w:r>
               <w:rPr>
                 <w:sz w:val="20"/>
@@ -1801,6 +2037,7 @@
               </w:rPr>
               <w:t>fix_owner</w:t>
             </w:r>
+            <w:proofErr w:type="spellEnd"/>
             <w:r>
               <w:rPr>
                 <w:rFonts w:hint="eastAsia"/>
@@ -1855,6 +2092,7 @@
               </w:rPr>
               <w:t>{</w:t>
             </w:r>
+            <w:proofErr w:type="spellStart"/>
             <w:r>
               <w:rPr>
                 <w:sz w:val="20"/>
@@ -1862,6 +2100,7 @@
               </w:rPr>
               <w:t>fix_man_hour</w:t>
             </w:r>
+            <w:proofErr w:type="spellEnd"/>
             <w:r>
               <w:rPr>
                 <w:sz w:val="20"/>
@@ -2192,7 +2431,23 @@
                 <w:sz w:val="20"/>
                 <w:szCs w:val="20"/>
               </w:rPr>
-              <w:t>{fix_reason}</w:t>
+              <w:t>{</w:t>
+            </w:r>
+            <w:proofErr w:type="spellStart"/>
+            <w:r>
+              <w:rPr>
+                <w:sz w:val="20"/>
+                <w:szCs w:val="20"/>
+              </w:rPr>
+              <w:t>fix_reason</w:t>
+            </w:r>
+            <w:proofErr w:type="spellEnd"/>
+            <w:r>
+              <w:rPr>
+                <w:sz w:val="20"/>
+                <w:szCs w:val="20"/>
+              </w:rPr>
+              <w:t>}</w:t>
             </w:r>
             <w:r>
               <w:rPr>
@@ -2225,6 +2480,7 @@
               </w:rPr>
               <w:t>{{</w:t>
             </w:r>
+            <w:proofErr w:type="spellStart"/>
             <w:r>
               <w:rPr>
                 <w:sz w:val="20"/>
@@ -2232,6 +2488,7 @@
               </w:rPr>
               <w:t>fix_solution</w:t>
             </w:r>
+            <w:proofErr w:type="spellEnd"/>
             <w:r>
               <w:rPr>
                 <w:rFonts w:hint="eastAsia"/>
@@ -2268,7 +2525,23 @@
                 <w:sz w:val="20"/>
                 <w:szCs w:val="20"/>
               </w:rPr>
-              <w:t>{fix_validation}</w:t>
+              <w:t>{</w:t>
+            </w:r>
+            <w:proofErr w:type="spellStart"/>
+            <w:r>
+              <w:rPr>
+                <w:sz w:val="20"/>
+                <w:szCs w:val="20"/>
+              </w:rPr>
+              <w:t>fix_validation</w:t>
+            </w:r>
+            <w:proofErr w:type="spellEnd"/>
+            <w:r>
+              <w:rPr>
+                <w:sz w:val="20"/>
+                <w:szCs w:val="20"/>
+              </w:rPr>
+              <w:t>}</w:t>
             </w:r>
             <w:r>
               <w:rPr>
@@ -2480,6 +2753,7 @@
             <w:r>
               <w:t>{</w:t>
             </w:r>
+            <w:proofErr w:type="spellStart"/>
             <w:r>
               <w:rPr>
                 <w:rFonts w:hint="eastAsia"/>
@@ -2489,6 +2763,7 @@
             <w:r>
               <w:t>_table</w:t>
             </w:r>
+            <w:proofErr w:type="spellEnd"/>
             <w:r>
               <w:t>}</w:t>
             </w:r>
@@ -2658,6 +2933,7 @@
             <w:r>
               <w:t>{</w:t>
             </w:r>
+            <w:proofErr w:type="spellStart"/>
             <w:r>
               <w:rPr>
                 <w:rFonts w:hint="eastAsia"/>
@@ -2676,6 +2952,7 @@
             <w:r>
               <w:t>_table</w:t>
             </w:r>
+            <w:proofErr w:type="spellEnd"/>
             <w:r>
               <w:t>}</w:t>
             </w:r>
@@ -2803,9 +3080,11 @@
             <w:r>
               <w:t>{</w:t>
             </w:r>
+            <w:proofErr w:type="spellStart"/>
             <w:r>
               <w:t>audit_table</w:t>
             </w:r>
+            <w:proofErr w:type="spellEnd"/>
             <w:r>
               <w:t>}</w:t>
             </w:r>
@@ -2832,38 +3111,31 @@
         <w:rPr>
           <w:rFonts w:hint="eastAsia"/>
         </w:rPr>
-        <w:t>验收人签名</w:t>
+        <w:t>审核人签名：</w:t>
       </w:r>
       <w:r>
         <w:rPr>
           <w:rFonts w:hint="eastAsia"/>
         </w:rPr>
-        <w:t>：</w:t>
+        <w:t xml:space="preserve"> </w:t>
       </w:r>
       <w:r>
-        <w:t xml:space="preserve"> {{</w:t>
+        <w:t>{{</w:t>
       </w:r>
       <w:r>
         <w:t>@</w:t>
       </w:r>
       <w:r>
-        <w:t>ack</w:t>
-      </w:r>
-      <w:r>
-        <w:t>_s</w:t>
-      </w:r>
-      <w:r>
-        <w:t>ignature</w:t>
-      </w:r>
-      <w:r>
-        <w:t>}}</w:t>
+        <w:t>signature}}</w:t>
       </w:r>
       <w:r>
         <w:t>{{</w:t>
       </w:r>
+      <w:proofErr w:type="spellStart"/>
       <w:r>
-        <w:t>ack_signature_space</w:t>
+        <w:t>signature_space</w:t>
       </w:r>
+      <w:proofErr w:type="spellEnd"/>
       <w:r>
         <w:t>}}</w:t>
       </w:r>
@@ -2877,34 +3149,40 @@
           <w:rFonts w:hint="eastAsia"/>
         </w:rPr>
         <w:lastRenderedPageBreak/>
-        <w:t>审核人签名：</w:t>
+        <w:t>验收人签名：</w:t>
       </w:r>
       <w:r>
-        <w:rPr>
-          <w:rFonts w:hint="eastAsia"/>
-        </w:rPr>
-        <w:t xml:space="preserve"> </w:t>
+        <w:t xml:space="preserve"> {{@</w:t>
       </w:r>
-      <w:bookmarkStart w:id="0" w:name="_GoBack"/>
-      <w:bookmarkEnd w:id="0"/>
+      <w:proofErr w:type="spellStart"/>
       <w:r>
-        <w:t>{{</w:t>
+        <w:t>ack</w:t>
       </w:r>
       <w:r>
-        <w:t>@</w:t>
+        <w:t>_s</w:t>
       </w:r>
       <w:r>
-        <w:t>signature}}</w:t>
+        <w:t>ignature</w:t>
       </w:r>
+      <w:proofErr w:type="spellEnd"/>
       <w:r>
-        <w:t>{{</w:t>
+        <w:t>}}{{</w:t>
       </w:r>
+      <w:proofErr w:type="spellStart"/>
       <w:r>
-        <w:t>signature_space</w:t>
+        <w:t>ack_signature_space</w:t>
       </w:r>
+      <w:proofErr w:type="spellEnd"/>
       <w:r>
         <w:t>}}</w:t>
       </w:r>
+    </w:p>
+    <w:p>
+      <w:pPr>
+        <w:jc w:val="right"/>
+      </w:pPr>
+      <w:bookmarkStart w:id="0" w:name="_GoBack"/>
+      <w:bookmarkEnd w:id="0"/>
     </w:p>
     <w:sectPr>
       <w:pgSz w:w="12240" w:h="15840"/>
@@ -3663,7 +3941,7 @@
 </file>
 
 <file path=customXml/itemProps1.xml><?xml version="1.0" encoding="utf-8"?>
-<ds:datastoreItem xmlns:ds="http://schemas.openxmlformats.org/officeDocument/2006/customXml" ds:itemID="{834F5F7A-A99C-472C-9CCA-87F9990DD878}">
+<ds:datastoreItem xmlns:ds="http://schemas.openxmlformats.org/officeDocument/2006/customXml" ds:itemID="{7AF9C68A-A723-4D71-BA87-97864C10A313}">
   <ds:schemaRefs>
     <ds:schemaRef ds:uri="http://schemas.openxmlformats.org/officeDocument/2006/bibliography"/>
   </ds:schemaRefs>

</xml_diff>

<commit_message>
YHAAO-2423 hide e-sign titles when e-sign image is absent
</commit_message>
<xml_diff>
--- a/src/src/main/webapp/portal/wo/woExportTemplate/template.docx
+++ b/src/src/main/webapp/portal/wo/woExportTemplate/template.docx
@@ -3108,16 +3108,20 @@
         <w:jc w:val="right"/>
       </w:pPr>
       <w:r>
-        <w:rPr>
-          <w:rFonts w:hint="eastAsia"/>
-        </w:rPr>
-        <w:t>审核人签名：</w:t>
+        <w:t>{{</w:t>
       </w:r>
+      <w:proofErr w:type="spellStart"/>
       <w:r>
-        <w:rPr>
-          <w:rFonts w:hint="eastAsia"/>
-        </w:rPr>
-        <w:t xml:space="preserve"> </w:t>
+        <w:t>signat</w:t>
+      </w:r>
+      <w:bookmarkStart w:id="0" w:name="_GoBack"/>
+      <w:bookmarkEnd w:id="0"/>
+      <w:r>
+        <w:t>ure_title</w:t>
+      </w:r>
+      <w:proofErr w:type="spellEnd"/>
+      <w:r>
+        <w:t>}}</w:t>
       </w:r>
       <w:r>
         <w:t>{{</w:t>
@@ -3128,31 +3132,33 @@
       <w:r>
         <w:t>signature}}</w:t>
       </w:r>
-      <w:r>
-        <w:t>{{</w:t>
-      </w:r>
-      <w:proofErr w:type="spellStart"/>
-      <w:r>
-        <w:t>signature_space</w:t>
-      </w:r>
-      <w:proofErr w:type="spellEnd"/>
-      <w:r>
-        <w:t>}}</w:t>
-      </w:r>
     </w:p>
     <w:p>
       <w:pPr>
         <w:jc w:val="right"/>
       </w:pPr>
       <w:r>
-        <w:rPr>
-          <w:rFonts w:hint="eastAsia"/>
-        </w:rPr>
         <w:lastRenderedPageBreak/>
-        <w:t>验收人签名：</w:t>
+        <w:t>{{</w:t>
+      </w:r>
+      <w:proofErr w:type="spellStart"/>
+      <w:r>
+        <w:t>ack_</w:t>
       </w:r>
       <w:r>
-        <w:t xml:space="preserve"> {{@</w:t>
+        <w:t>signature_title</w:t>
+      </w:r>
+      <w:proofErr w:type="spellEnd"/>
+      <w:proofErr w:type="gramStart"/>
+      <w:r>
+        <w:t>}}</w:t>
+      </w:r>
+      <w:r>
+        <w:t>{</w:t>
+      </w:r>
+      <w:proofErr w:type="gramEnd"/>
+      <w:r>
+        <w:t>{@</w:t>
       </w:r>
       <w:proofErr w:type="spellStart"/>
       <w:r>
@@ -3166,14 +3172,6 @@
       </w:r>
       <w:proofErr w:type="spellEnd"/>
       <w:r>
-        <w:t>}}{{</w:t>
-      </w:r>
-      <w:proofErr w:type="spellStart"/>
-      <w:r>
-        <w:t>ack_signature_space</w:t>
-      </w:r>
-      <w:proofErr w:type="spellEnd"/>
-      <w:r>
         <w:t>}}</w:t>
       </w:r>
     </w:p>
@@ -3181,8 +3179,6 @@
       <w:pPr>
         <w:jc w:val="right"/>
       </w:pPr>
-      <w:bookmarkStart w:id="0" w:name="_GoBack"/>
-      <w:bookmarkEnd w:id="0"/>
     </w:p>
     <w:sectPr>
       <w:pgSz w:w="12240" w:h="15840"/>
@@ -3941,7 +3937,7 @@
 </file>
 
 <file path=customXml/itemProps1.xml><?xml version="1.0" encoding="utf-8"?>
-<ds:datastoreItem xmlns:ds="http://schemas.openxmlformats.org/officeDocument/2006/customXml" ds:itemID="{7AF9C68A-A723-4D71-BA87-97864C10A313}">
+<ds:datastoreItem xmlns:ds="http://schemas.openxmlformats.org/officeDocument/2006/customXml" ds:itemID="{6D1CB04C-16E5-4C5F-BF8E-8C307E9B2ED1}">
   <ds:schemaRefs>
     <ds:schemaRef ds:uri="http://schemas.openxmlformats.org/officeDocument/2006/bibliography"/>
   </ds:schemaRefs>

</xml_diff>